<commit_message>
script update, design document updatet
</commit_message>
<xml_diff>
--- a/Architektur/Design/Design_Dokumentation.docx
+++ b/Architektur/Design/Design_Dokumentation.docx
@@ -164,7 +164,7 @@
       <w:r>
         <w:drawing>
           <wp:inline xmlns:a="http://schemas.openxmlformats.org/drawingml/2006/main" xmlns:pic="http://schemas.openxmlformats.org/drawingml/2006/picture">
-            <wp:extent cx="5486400" cy="3437051"/>
+            <wp:extent cx="5486400" cy="801643"/>
             <wp:docPr id="1" name="Picture 1"/>
             <wp:cNvGraphicFramePr>
               <a:graphicFrameLocks noChangeAspect="1"/>
@@ -185,7 +185,7 @@
                   <pic:spPr>
                     <a:xfrm>
                       <a:off x="0" y="0"/>
-                      <a:ext cx="5486400" cy="3437051"/>
+                      <a:ext cx="5486400" cy="801643"/>
                     </a:xfrm>
                     <a:prstGeom prst="rect"/>
                   </pic:spPr>
@@ -228,7 +228,7 @@
     </w:p>
     <w:p>
       <w:r>
-        <w:t>In der Mitte liegt eine große Fakten-Tabelle (`fact_health_metrics`). Drumherum liegen Dimensionen (Nutzer, Zeit, Medikamente, Lifestyle), die einfach per Join verknüpft werden können. Das ist viel schneller als im verzweigten Eingangs-Modell zu suchen.</w:t>
+        <w:t>In der Mitte liegt eine große Fakten: `fact_health_metrics` (Messwerte, Pulsdruck, Flags). Drumherum liegen Dimensionen (Nutzer, Zeit, Medikamente, Lifestyle), die einfach per Join verknüpft werden können. Das ist viel schneller als im verzweigten Eingangs-Modell zu suchen.</w:t>
       </w:r>
     </w:p>
     <w:p/>
@@ -244,7 +244,7 @@
       <w:r>
         <w:drawing>
           <wp:inline xmlns:a="http://schemas.openxmlformats.org/drawingml/2006/main" xmlns:pic="http://schemas.openxmlformats.org/drawingml/2006/picture">
-            <wp:extent cx="5486400" cy="3257677"/>
+            <wp:extent cx="5486400" cy="4283208"/>
             <wp:docPr id="2" name="Picture 2"/>
             <wp:cNvGraphicFramePr>
               <a:graphicFrameLocks noChangeAspect="1"/>
@@ -265,7 +265,7 @@
                   <pic:spPr>
                     <a:xfrm>
                       <a:off x="0" y="0"/>
-                      <a:ext cx="5486400" cy="3257677"/>
+                      <a:ext cx="5486400" cy="4283208"/>
                     </a:xfrm>
                     <a:prstGeom prst="rect"/>
                   </pic:spPr>
@@ -795,6 +795,58 @@
           </w:tcPr>
           <w:p>
             <w:r>
+              <w:t>`raw_activity_daily`</w:t>
+            </w:r>
+          </w:p>
+        </w:tc>
+        <w:tc>
+          <w:tcPr>
+            <w:tcW w:type="dxa" w:w="1728"/>
+          </w:tcPr>
+          <w:p>
+            <w:r>
+              <w:t>`activity_minutes`</w:t>
+            </w:r>
+          </w:p>
+        </w:tc>
+        <w:tc>
+          <w:tcPr>
+            <w:tcW w:type="dxa" w:w="1728"/>
+          </w:tcPr>
+          <w:p>
+            <w:r>
+              <w:t>`fact_health_metrics`</w:t>
+            </w:r>
+          </w:p>
+        </w:tc>
+        <w:tc>
+          <w:tcPr>
+            <w:tcW w:type="dxa" w:w="1728"/>
+          </w:tcPr>
+          <w:p>
+            <w:r>
+              <w:t>`activity_minutes`</w:t>
+            </w:r>
+          </w:p>
+        </w:tc>
+        <w:tc>
+          <w:tcPr>
+            <w:tcW w:type="dxa" w:w="1728"/>
+          </w:tcPr>
+          <w:p>
+            <w:r>
+              <w:t>Direkte Übernahme</w:t>
+            </w:r>
+          </w:p>
+        </w:tc>
+      </w:tr>
+      <w:tr>
+        <w:tc>
+          <w:tcPr>
+            <w:tcW w:type="dxa" w:w="1728"/>
+          </w:tcPr>
+          <w:p>
+            <w:r>
               <w:t>`master_lifestyle`</w:t>
             </w:r>
           </w:p>
@@ -835,7 +887,7 @@
           </w:tcPr>
           <w:p>
             <w:r>
-              <w:t>Übernahme des Aktivitätsstatus</w:t>
+              <w:t>Übernahme Aktivitätsstatus</w:t>
             </w:r>
           </w:p>
         </w:tc>
@@ -857,7 +909,59 @@
           </w:tcPr>
           <w:p>
             <w:r>
-              <w:t>`name`, `age`</w:t>
+              <w:t>`is_smoker`</w:t>
+            </w:r>
+          </w:p>
+        </w:tc>
+        <w:tc>
+          <w:tcPr>
+            <w:tcW w:type="dxa" w:w="1728"/>
+          </w:tcPr>
+          <w:p>
+            <w:r>
+              <w:t>`dim_lifestyle`</w:t>
+            </w:r>
+          </w:p>
+        </w:tc>
+        <w:tc>
+          <w:tcPr>
+            <w:tcW w:type="dxa" w:w="1728"/>
+          </w:tcPr>
+          <w:p>
+            <w:r>
+              <w:t>`is_smoker`</w:t>
+            </w:r>
+          </w:p>
+        </w:tc>
+        <w:tc>
+          <w:tcPr>
+            <w:tcW w:type="dxa" w:w="1728"/>
+          </w:tcPr>
+          <w:p>
+            <w:r>
+              <w:t>Übernahme Raucherstatus</w:t>
+            </w:r>
+          </w:p>
+        </w:tc>
+      </w:tr>
+      <w:tr>
+        <w:tc>
+          <w:tcPr>
+            <w:tcW w:type="dxa" w:w="1728"/>
+          </w:tcPr>
+          <w:p>
+            <w:r>
+              <w:t>`master_lifestyle`</w:t>
+            </w:r>
+          </w:p>
+        </w:tc>
+        <w:tc>
+          <w:tcPr>
+            <w:tcW w:type="dxa" w:w="1728"/>
+          </w:tcPr>
+          <w:p>
+            <w:r>
+              <w:t>`age`</w:t>
             </w:r>
           </w:p>
         </w:tc>
@@ -877,7 +981,7 @@
           </w:tcPr>
           <w:p>
             <w:r>
-              <w:t>`name`, `age`</w:t>
+              <w:t>`age`</w:t>
             </w:r>
           </w:p>
         </w:tc>
@@ -887,7 +991,59 @@
           </w:tcPr>
           <w:p>
             <w:r>
-              <w:t>Stammdaten-Migration</w:t>
+              <w:t>Direkte Übernahme</w:t>
+            </w:r>
+          </w:p>
+        </w:tc>
+      </w:tr>
+      <w:tr>
+        <w:tc>
+          <w:tcPr>
+            <w:tcW w:type="dxa" w:w="1728"/>
+          </w:tcPr>
+          <w:p>
+            <w:r>
+              <w:t>`master_lifestyle`</w:t>
+            </w:r>
+          </w:p>
+        </w:tc>
+        <w:tc>
+          <w:tcPr>
+            <w:tcW w:type="dxa" w:w="1728"/>
+          </w:tcPr>
+          <w:p>
+            <w:r>
+              <w:t>`gender`</w:t>
+            </w:r>
+          </w:p>
+        </w:tc>
+        <w:tc>
+          <w:tcPr>
+            <w:tcW w:type="dxa" w:w="1728"/>
+          </w:tcPr>
+          <w:p>
+            <w:r>
+              <w:t>`dim_user`</w:t>
+            </w:r>
+          </w:p>
+        </w:tc>
+        <w:tc>
+          <w:tcPr>
+            <w:tcW w:type="dxa" w:w="1728"/>
+          </w:tcPr>
+          <w:p>
+            <w:r>
+              <w:t>`gender`</w:t>
+            </w:r>
+          </w:p>
+        </w:tc>
+        <w:tc>
+          <w:tcPr>
+            <w:tcW w:type="dxa" w:w="1728"/>
+          </w:tcPr>
+          <w:p>
+            <w:r>
+              <w:t>Übernahme (m/w/d) als `varchar(1)`</w:t>
             </w:r>
           </w:p>
         </w:tc>
@@ -1002,7 +1158,7 @@
         <w:pStyle w:val="ListBullet"/>
       </w:pPr>
       <w:r>
-        <w:t xml:space="preserve">  `valid_from`: Ab wann gilt dieser Zustand?</w:t>
+        <w:t xml:space="preserve">  `SCD_valid_from`: Ab wann gilt dieser Zustand?</w:t>
       </w:r>
     </w:p>
     <w:p>
@@ -1010,7 +1166,7 @@
         <w:pStyle w:val="ListBullet"/>
       </w:pPr>
       <w:r>
-        <w:t xml:space="preserve">  `valid_to`: Bis wann galt dieser Zustand? (NULL = aktuell gültig).</w:t>
+        <w:t xml:space="preserve">  `SCD_valid_to`: Bis wann galt dieser Zustand? (NULL = aktuell gültig).</w:t>
       </w:r>
     </w:p>
     <w:p/>

</xml_diff>

<commit_message>
documentation for incremental load updated
</commit_message>
<xml_diff>
--- a/Architektur/Design/Design_Dokumentation.docx
+++ b/Architektur/Design/Design_Dokumentation.docx
@@ -268,7 +268,7 @@
       <w:r>
         <w:drawing>
           <wp:inline xmlns:a="http://schemas.openxmlformats.org/drawingml/2006/main" xmlns:pic="http://schemas.openxmlformats.org/drawingml/2006/picture">
-            <wp:extent cx="5486400" cy="4283208"/>
+            <wp:extent cx="5486400" cy="4450642"/>
             <wp:docPr id="2" name="Picture 2"/>
             <wp:cNvGraphicFramePr>
               <a:graphicFrameLocks noChangeAspect="1"/>
@@ -289,7 +289,7 @@
                   <pic:spPr>
                     <a:xfrm>
                       <a:off x="0" y="0"/>
-                      <a:ext cx="5486400" cy="4283208"/>
+                      <a:ext cx="5486400" cy="4450642"/>
                     </a:xfrm>
                     <a:prstGeom prst="rect"/>
                   </pic:spPr>
@@ -715,6 +715,110 @@
           </w:tcPr>
           <w:p>
             <w:r>
+              <w:t>-</w:t>
+            </w:r>
+          </w:p>
+        </w:tc>
+        <w:tc>
+          <w:tcPr>
+            <w:tcW w:type="dxa" w:w="1728"/>
+          </w:tcPr>
+          <w:p>
+            <w:r>
+              <w:t>-</w:t>
+            </w:r>
+          </w:p>
+        </w:tc>
+        <w:tc>
+          <w:tcPr>
+            <w:tcW w:type="dxa" w:w="1728"/>
+          </w:tcPr>
+          <w:p>
+            <w:r>
+              <w:t>`fact_health_metrics`</w:t>
+            </w:r>
+          </w:p>
+        </w:tc>
+        <w:tc>
+          <w:tcPr>
+            <w:tcW w:type="dxa" w:w="1728"/>
+          </w:tcPr>
+          <w:p>
+            <w:r>
+              <w:t>**`med_key`**</w:t>
+            </w:r>
+          </w:p>
+        </w:tc>
+        <w:tc>
+          <w:tcPr>
+            <w:tcW w:type="dxa" w:w="1728"/>
+          </w:tcPr>
+          <w:p>
+            <w:r>
+              <w:t>Verknüpfung über aktuellen Surrogate Key</w:t>
+            </w:r>
+          </w:p>
+        </w:tc>
+      </w:tr>
+      <w:tr>
+        <w:tc>
+          <w:tcPr>
+            <w:tcW w:type="dxa" w:w="1728"/>
+          </w:tcPr>
+          <w:p>
+            <w:r>
+              <w:t>-</w:t>
+            </w:r>
+          </w:p>
+        </w:tc>
+        <w:tc>
+          <w:tcPr>
+            <w:tcW w:type="dxa" w:w="1728"/>
+          </w:tcPr>
+          <w:p>
+            <w:r>
+              <w:t>-</w:t>
+            </w:r>
+          </w:p>
+        </w:tc>
+        <w:tc>
+          <w:tcPr>
+            <w:tcW w:type="dxa" w:w="1728"/>
+          </w:tcPr>
+          <w:p>
+            <w:r>
+              <w:t>`fact_health_metrics`</w:t>
+            </w:r>
+          </w:p>
+        </w:tc>
+        <w:tc>
+          <w:tcPr>
+            <w:tcW w:type="dxa" w:w="1728"/>
+          </w:tcPr>
+          <w:p>
+            <w:r>
+              <w:t>**`lifestyle_key`**</w:t>
+            </w:r>
+          </w:p>
+        </w:tc>
+        <w:tc>
+          <w:tcPr>
+            <w:tcW w:type="dxa" w:w="1728"/>
+          </w:tcPr>
+          <w:p>
+            <w:r>
+              <w:t>Verknüpfung über aktuellen Surrogate Key</w:t>
+            </w:r>
+          </w:p>
+        </w:tc>
+      </w:tr>
+      <w:tr>
+        <w:tc>
+          <w:tcPr>
+            <w:tcW w:type="dxa" w:w="1728"/>
+          </w:tcPr>
+          <w:p>
+            <w:r>
               <w:t>`raw_activity_daily`</w:t>
             </w:r>
           </w:p>
@@ -1015,7 +1119,7 @@
           </w:tcPr>
           <w:p>
             <w:r>
-              <w:t>PK-Migration</w:t>
+              <w:t>Migration Business Key</w:t>
             </w:r>
           </w:p>
         </w:tc>
@@ -1119,7 +1223,7 @@
           </w:tcPr>
           <w:p>
             <w:r>
-              <w:t>Übernahme (m/w/d) als `varchar(1)`</w:t>
+              <w:t>Übernahme (m/w/d)</w:t>
             </w:r>
           </w:p>
         </w:tc>
@@ -1171,7 +1275,7 @@
           </w:tcPr>
           <w:p>
             <w:r>
-              <w:t>`True`, falls Messung innerhalb 4h nach Einnahme (morgens=8h, mittags=13h, abends=19h, nachts=23h)</w:t>
+              <w:t>`True`, falls Messung innerhalb 4h nach Einnahme</w:t>
             </w:r>
           </w:p>
         </w:tc>
@@ -1223,7 +1327,7 @@
           </w:tcPr>
           <w:p>
             <w:r>
-              <w:t>PK-Migration</w:t>
+              <w:t>Migration Business Key</w:t>
             </w:r>
           </w:p>
         </w:tc>
@@ -1276,6 +1380,58 @@
           <w:p>
             <w:r>
               <w:t>Stammdaten-Migration</w:t>
+            </w:r>
+          </w:p>
+        </w:tc>
+      </w:tr>
+      <w:tr>
+        <w:tc>
+          <w:tcPr>
+            <w:tcW w:type="dxa" w:w="1728"/>
+          </w:tcPr>
+          <w:p>
+            <w:r>
+              <w:t>-</w:t>
+            </w:r>
+          </w:p>
+        </w:tc>
+        <w:tc>
+          <w:tcPr>
+            <w:tcW w:type="dxa" w:w="1728"/>
+          </w:tcPr>
+          <w:p>
+            <w:r>
+              <w:t>-</w:t>
+            </w:r>
+          </w:p>
+        </w:tc>
+        <w:tc>
+          <w:tcPr>
+            <w:tcW w:type="dxa" w:w="1728"/>
+          </w:tcPr>
+          <w:p>
+            <w:r>
+              <w:t>`fact_health_metrics`</w:t>
+            </w:r>
+          </w:p>
+        </w:tc>
+        <w:tc>
+          <w:tcPr>
+            <w:tcW w:type="dxa" w:w="1728"/>
+          </w:tcPr>
+          <w:p>
+            <w:r>
+              <w:t>`load_timestamp`</w:t>
+            </w:r>
+          </w:p>
+        </w:tc>
+        <w:tc>
+          <w:tcPr>
+            <w:tcW w:type="dxa" w:w="1728"/>
+          </w:tcPr>
+          <w:p>
+            <w:r>
+              <w:t>Technischer Zeitstamp beim Import</w:t>
             </w:r>
           </w:p>
         </w:tc>
@@ -1346,7 +1502,7 @@
         <w:pStyle w:val="ListBullet"/>
       </w:pPr>
       <w:r>
-        <w:t xml:space="preserve">  `SCD_valid_to`: Bis wann galt dieser Zustand? (NULL = aktuell gültig).</w:t>
+        <w:t xml:space="preserve">  `SCD_valid_to`: Bis wann galt dieser Zustand? (**9999-12-31** = aktuell gültig).</w:t>
       </w:r>
     </w:p>
     <w:p/>

</xml_diff>